<commit_message>
docs: add precise file and line references to the demo run-sheet
</commit_message>
<xml_diff>
--- a/presentation/ParaBank_10min_Demo_Runsheet.docx
+++ b/presentation/ParaBank_10min_Demo_Runsheet.docx
@@ -2160,7 +2160,1026 @@
           <w:sz w:val="20"/>
           <w:szCs w:val="20"/>
         </w:rPr>
-        <w:t xml:space="preserve">Switch to the code editor. Trace ONE scenario - sign in and view the balance - through every layer.</w:t>
+        <w:t xml:space="preserve">Switch to the code editor and trace ONE scenario - "sign in and view the balance" - through every layer. Open these six files, at these exact lines, in order:</w:t>
+      </w:r>
+    </w:p>
+    <w:tbl>
+      <w:tblPr>
+        <w:tblW w:type="dxa" w:w="9360"/>
+        <w:tblBorders>
+          <w:top w:val="single" w:color="auto" w:sz="4"/>
+          <w:left w:val="single" w:color="auto" w:sz="4"/>
+          <w:bottom w:val="single" w:color="auto" w:sz="4"/>
+          <w:right w:val="single" w:color="auto" w:sz="4"/>
+          <w:insideH w:val="single" w:color="auto" w:sz="4"/>
+          <w:insideV w:val="single" w:color="auto" w:sz="4"/>
+        </w:tblBorders>
+      </w:tblPr>
+      <w:tblGrid>
+        <w:gridCol w:w="520"/>
+        <w:gridCol w:w="3360"/>
+        <w:gridCol w:w="1560"/>
+        <w:gridCol w:w="3920"/>
+      </w:tblGrid>
+      <w:tr>
+        <w:trPr>
+          <w:tblHeader/>
+        </w:trPr>
+        <w:tc>
+          <w:tcPr>
+            <w:tcW w:type="dxa" w:w="520"/>
+            <w:tcBorders>
+              <w:top w:val="single" w:color="BFBFBF" w:sz="1"/>
+              <w:left w:val="single" w:color="BFBFBF" w:sz="1"/>
+              <w:bottom w:val="single" w:color="BFBFBF" w:sz="1"/>
+              <w:right w:val="single" w:color="BFBFBF" w:sz="1"/>
+            </w:tcBorders>
+            <w:shd w:fill="1F3864" w:val="clear"/>
+            <w:tcMar>
+              <w:top w:type="dxa" w:w="60"/>
+              <w:left w:type="dxa" w:w="110"/>
+              <w:bottom w:type="dxa" w:w="60"/>
+              <w:right w:type="dxa" w:w="110"/>
+            </w:tcMar>
+            <w:vAlign w:val="center"/>
+          </w:tcPr>
+          <w:p>
+            <w:pPr>
+              <w:spacing w:after="0"/>
+              <w:jc w:val="center"/>
+            </w:pPr>
+            <w:r>
+              <w:rPr>
+                <w:rFonts w:ascii="Arial" w:cs="Arial" w:eastAsia="Arial" w:hAnsi="Arial"/>
+                <w:b/>
+                <w:bCs/>
+                <w:color w:val="FFFFFF"/>
+                <w:sz w:val="18"/>
+                <w:szCs w:val="18"/>
+              </w:rPr>
+              <w:t xml:space="preserve">#</w:t>
+            </w:r>
+          </w:p>
+        </w:tc>
+        <w:tc>
+          <w:tcPr>
+            <w:tcW w:type="dxa" w:w="3360"/>
+            <w:tcBorders>
+              <w:top w:val="single" w:color="BFBFBF" w:sz="1"/>
+              <w:left w:val="single" w:color="BFBFBF" w:sz="1"/>
+              <w:bottom w:val="single" w:color="BFBFBF" w:sz="1"/>
+              <w:right w:val="single" w:color="BFBFBF" w:sz="1"/>
+            </w:tcBorders>
+            <w:shd w:fill="1F3864" w:val="clear"/>
+            <w:tcMar>
+              <w:top w:type="dxa" w:w="60"/>
+              <w:left w:type="dxa" w:w="110"/>
+              <w:bottom w:type="dxa" w:w="60"/>
+              <w:right w:type="dxa" w:w="110"/>
+            </w:tcMar>
+            <w:vAlign w:val="center"/>
+          </w:tcPr>
+          <w:p>
+            <w:pPr>
+              <w:spacing w:after="0"/>
+              <w:jc w:val="center"/>
+            </w:pPr>
+            <w:r>
+              <w:rPr>
+                <w:rFonts w:ascii="Arial" w:cs="Arial" w:eastAsia="Arial" w:hAnsi="Arial"/>
+                <w:b/>
+                <w:bCs/>
+                <w:color w:val="FFFFFF"/>
+                <w:sz w:val="18"/>
+                <w:szCs w:val="18"/>
+              </w:rPr>
+              <w:t xml:space="preserve">File</w:t>
+            </w:r>
+          </w:p>
+        </w:tc>
+        <w:tc>
+          <w:tcPr>
+            <w:tcW w:type="dxa" w:w="1560"/>
+            <w:tcBorders>
+              <w:top w:val="single" w:color="BFBFBF" w:sz="1"/>
+              <w:left w:val="single" w:color="BFBFBF" w:sz="1"/>
+              <w:bottom w:val="single" w:color="BFBFBF" w:sz="1"/>
+              <w:right w:val="single" w:color="BFBFBF" w:sz="1"/>
+            </w:tcBorders>
+            <w:shd w:fill="1F3864" w:val="clear"/>
+            <w:tcMar>
+              <w:top w:type="dxa" w:w="60"/>
+              <w:left w:type="dxa" w:w="110"/>
+              <w:bottom w:type="dxa" w:w="60"/>
+              <w:right w:type="dxa" w:w="110"/>
+            </w:tcMar>
+            <w:vAlign w:val="center"/>
+          </w:tcPr>
+          <w:p>
+            <w:pPr>
+              <w:spacing w:after="0"/>
+              <w:jc w:val="center"/>
+            </w:pPr>
+            <w:r>
+              <w:rPr>
+                <w:rFonts w:ascii="Arial" w:cs="Arial" w:eastAsia="Arial" w:hAnsi="Arial"/>
+                <w:b/>
+                <w:bCs/>
+                <w:color w:val="FFFFFF"/>
+                <w:sz w:val="18"/>
+                <w:szCs w:val="18"/>
+              </w:rPr>
+              <w:t xml:space="preserve">Lines</w:t>
+            </w:r>
+          </w:p>
+        </w:tc>
+        <w:tc>
+          <w:tcPr>
+            <w:tcW w:type="dxa" w:w="3920"/>
+            <w:tcBorders>
+              <w:top w:val="single" w:color="BFBFBF" w:sz="1"/>
+              <w:left w:val="single" w:color="BFBFBF" w:sz="1"/>
+              <w:bottom w:val="single" w:color="BFBFBF" w:sz="1"/>
+              <w:right w:val="single" w:color="BFBFBF" w:sz="1"/>
+            </w:tcBorders>
+            <w:shd w:fill="1F3864" w:val="clear"/>
+            <w:tcMar>
+              <w:top w:type="dxa" w:w="60"/>
+              <w:left w:type="dxa" w:w="110"/>
+              <w:bottom w:type="dxa" w:w="60"/>
+              <w:right w:type="dxa" w:w="110"/>
+            </w:tcMar>
+            <w:vAlign w:val="center"/>
+          </w:tcPr>
+          <w:p>
+            <w:pPr>
+              <w:spacing w:after="0"/>
+              <w:jc w:val="center"/>
+            </w:pPr>
+            <w:r>
+              <w:rPr>
+                <w:rFonts w:ascii="Arial" w:cs="Arial" w:eastAsia="Arial" w:hAnsi="Arial"/>
+                <w:b/>
+                <w:bCs/>
+                <w:color w:val="FFFFFF"/>
+                <w:sz w:val="18"/>
+                <w:szCs w:val="18"/>
+              </w:rPr>
+              <w:t xml:space="preserve">What to show</w:t>
+            </w:r>
+          </w:p>
+        </w:tc>
+      </w:tr>
+      <w:tr>
+        <w:tc>
+          <w:tcPr>
+            <w:tcW w:type="dxa" w:w="520"/>
+            <w:tcBorders>
+              <w:top w:val="single" w:color="BFBFBF" w:sz="1"/>
+              <w:left w:val="single" w:color="BFBFBF" w:sz="1"/>
+              <w:bottom w:val="single" w:color="BFBFBF" w:sz="1"/>
+              <w:right w:val="single" w:color="BFBFBF" w:sz="1"/>
+            </w:tcBorders>
+            <w:tcMar>
+              <w:top w:type="dxa" w:w="60"/>
+              <w:left w:type="dxa" w:w="110"/>
+              <w:bottom w:type="dxa" w:w="60"/>
+              <w:right w:type="dxa" w:w="110"/>
+            </w:tcMar>
+            <w:vAlign w:val="center"/>
+          </w:tcPr>
+          <w:p>
+            <w:pPr>
+              <w:spacing w:after="0"/>
+              <w:jc w:val="center"/>
+            </w:pPr>
+            <w:r>
+              <w:rPr>
+                <w:rFonts w:ascii="Arial" w:cs="Arial" w:eastAsia="Arial" w:hAnsi="Arial"/>
+                <w:b/>
+                <w:bCs/>
+                <w:sz w:val="18"/>
+                <w:szCs w:val="18"/>
+              </w:rPr>
+              <w:t xml:space="preserve">1</w:t>
+            </w:r>
+          </w:p>
+        </w:tc>
+        <w:tc>
+          <w:tcPr>
+            <w:tcW w:type="dxa" w:w="3360"/>
+            <w:tcBorders>
+              <w:top w:val="single" w:color="BFBFBF" w:sz="1"/>
+              <w:left w:val="single" w:color="BFBFBF" w:sz="1"/>
+              <w:bottom w:val="single" w:color="BFBFBF" w:sz="1"/>
+              <w:right w:val="single" w:color="BFBFBF" w:sz="1"/>
+            </w:tcBorders>
+            <w:tcMar>
+              <w:top w:type="dxa" w:w="60"/>
+              <w:left w:type="dxa" w:w="110"/>
+              <w:bottom w:type="dxa" w:w="60"/>
+              <w:right w:type="dxa" w:w="110"/>
+            </w:tcMar>
+            <w:vAlign w:val="center"/>
+          </w:tcPr>
+          <w:p>
+            <w:pPr>
+              <w:spacing w:after="0"/>
+              <w:jc w:val="left"/>
+            </w:pPr>
+            <w:r>
+              <w:rPr>
+                <w:rFonts w:ascii="Arial" w:cs="Arial" w:eastAsia="Arial" w:hAnsi="Arial"/>
+                <w:b w:val="false"/>
+                <w:bCs w:val="false"/>
+                <w:sz w:val="18"/>
+                <w:szCs w:val="18"/>
+              </w:rPr>
+              <w:t xml:space="preserve">features/account-login.feature</w:t>
+            </w:r>
+          </w:p>
+        </w:tc>
+        <w:tc>
+          <w:tcPr>
+            <w:tcW w:type="dxa" w:w="1560"/>
+            <w:tcBorders>
+              <w:top w:val="single" w:color="BFBFBF" w:sz="1"/>
+              <w:left w:val="single" w:color="BFBFBF" w:sz="1"/>
+              <w:bottom w:val="single" w:color="BFBFBF" w:sz="1"/>
+              <w:right w:val="single" w:color="BFBFBF" w:sz="1"/>
+            </w:tcBorders>
+            <w:tcMar>
+              <w:top w:type="dxa" w:w="60"/>
+              <w:left w:type="dxa" w:w="110"/>
+              <w:bottom w:type="dxa" w:w="60"/>
+              <w:right w:type="dxa" w:w="110"/>
+            </w:tcMar>
+            <w:vAlign w:val="center"/>
+          </w:tcPr>
+          <w:p>
+            <w:pPr>
+              <w:spacing w:after="0"/>
+              <w:jc w:val="center"/>
+            </w:pPr>
+            <w:r>
+              <w:rPr>
+                <w:rFonts w:ascii="Arial" w:cs="Arial" w:eastAsia="Arial" w:hAnsi="Arial"/>
+                <w:b w:val="false"/>
+                <w:bCs w:val="false"/>
+                <w:sz w:val="18"/>
+                <w:szCs w:val="18"/>
+              </w:rPr>
+              <w:t xml:space="preserve">8 - 13</w:t>
+            </w:r>
+          </w:p>
+        </w:tc>
+        <w:tc>
+          <w:tcPr>
+            <w:tcW w:type="dxa" w:w="3920"/>
+            <w:tcBorders>
+              <w:top w:val="single" w:color="BFBFBF" w:sz="1"/>
+              <w:left w:val="single" w:color="BFBFBF" w:sz="1"/>
+              <w:bottom w:val="single" w:color="BFBFBF" w:sz="1"/>
+              <w:right w:val="single" w:color="BFBFBF" w:sz="1"/>
+            </w:tcBorders>
+            <w:tcMar>
+              <w:top w:type="dxa" w:w="60"/>
+              <w:left w:type="dxa" w:w="110"/>
+              <w:bottom w:type="dxa" w:w="60"/>
+              <w:right w:type="dxa" w:w="110"/>
+            </w:tcMar>
+            <w:vAlign w:val="center"/>
+          </w:tcPr>
+          <w:p>
+            <w:pPr>
+              <w:spacing w:after="0"/>
+              <w:jc w:val="left"/>
+            </w:pPr>
+            <w:r>
+              <w:rPr>
+                <w:rFonts w:ascii="Arial" w:cs="Arial" w:eastAsia="Arial" w:hAnsi="Arial"/>
+                <w:b w:val="false"/>
+                <w:bCs w:val="false"/>
+                <w:sz w:val="18"/>
+                <w:szCs w:val="18"/>
+              </w:rPr>
+              <w:t xml:space="preserve">The Gherkin scenario</w:t>
+            </w:r>
+          </w:p>
+        </w:tc>
+      </w:tr>
+      <w:tr>
+        <w:tc>
+          <w:tcPr>
+            <w:tcW w:type="dxa" w:w="520"/>
+            <w:tcBorders>
+              <w:top w:val="single" w:color="BFBFBF" w:sz="1"/>
+              <w:left w:val="single" w:color="BFBFBF" w:sz="1"/>
+              <w:bottom w:val="single" w:color="BFBFBF" w:sz="1"/>
+              <w:right w:val="single" w:color="BFBFBF" w:sz="1"/>
+            </w:tcBorders>
+            <w:shd w:fill="F4F6FB" w:val="clear"/>
+            <w:tcMar>
+              <w:top w:type="dxa" w:w="60"/>
+              <w:left w:type="dxa" w:w="110"/>
+              <w:bottom w:type="dxa" w:w="60"/>
+              <w:right w:type="dxa" w:w="110"/>
+            </w:tcMar>
+            <w:vAlign w:val="center"/>
+          </w:tcPr>
+          <w:p>
+            <w:pPr>
+              <w:spacing w:after="0"/>
+              <w:jc w:val="center"/>
+            </w:pPr>
+            <w:r>
+              <w:rPr>
+                <w:rFonts w:ascii="Arial" w:cs="Arial" w:eastAsia="Arial" w:hAnsi="Arial"/>
+                <w:b/>
+                <w:bCs/>
+                <w:sz w:val="18"/>
+                <w:szCs w:val="18"/>
+              </w:rPr>
+              <w:t xml:space="preserve">2</w:t>
+            </w:r>
+          </w:p>
+        </w:tc>
+        <w:tc>
+          <w:tcPr>
+            <w:tcW w:type="dxa" w:w="3360"/>
+            <w:tcBorders>
+              <w:top w:val="single" w:color="BFBFBF" w:sz="1"/>
+              <w:left w:val="single" w:color="BFBFBF" w:sz="1"/>
+              <w:bottom w:val="single" w:color="BFBFBF" w:sz="1"/>
+              <w:right w:val="single" w:color="BFBFBF" w:sz="1"/>
+            </w:tcBorders>
+            <w:shd w:fill="F4F6FB" w:val="clear"/>
+            <w:tcMar>
+              <w:top w:type="dxa" w:w="60"/>
+              <w:left w:type="dxa" w:w="110"/>
+              <w:bottom w:type="dxa" w:w="60"/>
+              <w:right w:type="dxa" w:w="110"/>
+            </w:tcMar>
+            <w:vAlign w:val="center"/>
+          </w:tcPr>
+          <w:p>
+            <w:pPr>
+              <w:spacing w:after="0"/>
+              <w:jc w:val="left"/>
+            </w:pPr>
+            <w:r>
+              <w:rPr>
+                <w:rFonts w:ascii="Arial" w:cs="Arial" w:eastAsia="Arial" w:hAnsi="Arial"/>
+                <w:b w:val="false"/>
+                <w:bCs w:val="false"/>
+                <w:sz w:val="18"/>
+                <w:szCs w:val="18"/>
+              </w:rPr>
+              <w:t xml:space="preserve">src/steps/login.steps.ts</w:t>
+            </w:r>
+          </w:p>
+        </w:tc>
+        <w:tc>
+          <w:tcPr>
+            <w:tcW w:type="dxa" w:w="1560"/>
+            <w:tcBorders>
+              <w:top w:val="single" w:color="BFBFBF" w:sz="1"/>
+              <w:left w:val="single" w:color="BFBFBF" w:sz="1"/>
+              <w:bottom w:val="single" w:color="BFBFBF" w:sz="1"/>
+              <w:right w:val="single" w:color="BFBFBF" w:sz="1"/>
+            </w:tcBorders>
+            <w:shd w:fill="F4F6FB" w:val="clear"/>
+            <w:tcMar>
+              <w:top w:type="dxa" w:w="60"/>
+              <w:left w:type="dxa" w:w="110"/>
+              <w:bottom w:type="dxa" w:w="60"/>
+              <w:right w:type="dxa" w:w="110"/>
+            </w:tcMar>
+            <w:vAlign w:val="center"/>
+          </w:tcPr>
+          <w:p>
+            <w:pPr>
+              <w:spacing w:after="0"/>
+              <w:jc w:val="center"/>
+            </w:pPr>
+            <w:r>
+              <w:rPr>
+                <w:rFonts w:ascii="Arial" w:cs="Arial" w:eastAsia="Arial" w:hAnsi="Arial"/>
+                <w:b w:val="false"/>
+                <w:bCs w:val="false"/>
+                <w:sz w:val="18"/>
+                <w:szCs w:val="18"/>
+              </w:rPr>
+              <w:t xml:space="preserve">28 - 34</w:t>
+            </w:r>
+          </w:p>
+        </w:tc>
+        <w:tc>
+          <w:tcPr>
+            <w:tcW w:type="dxa" w:w="3920"/>
+            <w:tcBorders>
+              <w:top w:val="single" w:color="BFBFBF" w:sz="1"/>
+              <w:left w:val="single" w:color="BFBFBF" w:sz="1"/>
+              <w:bottom w:val="single" w:color="BFBFBF" w:sz="1"/>
+              <w:right w:val="single" w:color="BFBFBF" w:sz="1"/>
+            </w:tcBorders>
+            <w:shd w:fill="F4F6FB" w:val="clear"/>
+            <w:tcMar>
+              <w:top w:type="dxa" w:w="60"/>
+              <w:left w:type="dxa" w:w="110"/>
+              <w:bottom w:type="dxa" w:w="60"/>
+              <w:right w:type="dxa" w:w="110"/>
+            </w:tcMar>
+            <w:vAlign w:val="center"/>
+          </w:tcPr>
+          <w:p>
+            <w:pPr>
+              <w:spacing w:after="0"/>
+              <w:jc w:val="left"/>
+            </w:pPr>
+            <w:r>
+              <w:rPr>
+                <w:rFonts w:ascii="Arial" w:cs="Arial" w:eastAsia="Arial" w:hAnsi="Arial"/>
+                <w:b w:val="false"/>
+                <w:bCs w:val="false"/>
+                <w:sz w:val="18"/>
+                <w:szCs w:val="18"/>
+              </w:rPr>
+              <w:t xml:space="preserve">The "When" step - calls the page object</w:t>
+            </w:r>
+          </w:p>
+        </w:tc>
+      </w:tr>
+      <w:tr>
+        <w:tc>
+          <w:tcPr>
+            <w:tcW w:type="dxa" w:w="520"/>
+            <w:tcBorders>
+              <w:top w:val="single" w:color="BFBFBF" w:sz="1"/>
+              <w:left w:val="single" w:color="BFBFBF" w:sz="1"/>
+              <w:bottom w:val="single" w:color="BFBFBF" w:sz="1"/>
+              <w:right w:val="single" w:color="BFBFBF" w:sz="1"/>
+            </w:tcBorders>
+            <w:tcMar>
+              <w:top w:type="dxa" w:w="60"/>
+              <w:left w:type="dxa" w:w="110"/>
+              <w:bottom w:type="dxa" w:w="60"/>
+              <w:right w:type="dxa" w:w="110"/>
+            </w:tcMar>
+            <w:vAlign w:val="center"/>
+          </w:tcPr>
+          <w:p>
+            <w:pPr>
+              <w:spacing w:after="0"/>
+              <w:jc w:val="center"/>
+            </w:pPr>
+            <w:r>
+              <w:rPr>
+                <w:rFonts w:ascii="Arial" w:cs="Arial" w:eastAsia="Arial" w:hAnsi="Arial"/>
+                <w:b/>
+                <w:bCs/>
+                <w:sz w:val="18"/>
+                <w:szCs w:val="18"/>
+              </w:rPr>
+              <w:t xml:space="preserve">3</w:t>
+            </w:r>
+          </w:p>
+        </w:tc>
+        <w:tc>
+          <w:tcPr>
+            <w:tcW w:type="dxa" w:w="3360"/>
+            <w:tcBorders>
+              <w:top w:val="single" w:color="BFBFBF" w:sz="1"/>
+              <w:left w:val="single" w:color="BFBFBF" w:sz="1"/>
+              <w:bottom w:val="single" w:color="BFBFBF" w:sz="1"/>
+              <w:right w:val="single" w:color="BFBFBF" w:sz="1"/>
+            </w:tcBorders>
+            <w:tcMar>
+              <w:top w:type="dxa" w:w="60"/>
+              <w:left w:type="dxa" w:w="110"/>
+              <w:bottom w:type="dxa" w:w="60"/>
+              <w:right w:type="dxa" w:w="110"/>
+            </w:tcMar>
+            <w:vAlign w:val="center"/>
+          </w:tcPr>
+          <w:p>
+            <w:pPr>
+              <w:spacing w:after="0"/>
+              <w:jc w:val="left"/>
+            </w:pPr>
+            <w:r>
+              <w:rPr>
+                <w:rFonts w:ascii="Arial" w:cs="Arial" w:eastAsia="Arial" w:hAnsi="Arial"/>
+                <w:b w:val="false"/>
+                <w:bCs w:val="false"/>
+                <w:sz w:val="18"/>
+                <w:szCs w:val="18"/>
+              </w:rPr>
+              <w:t xml:space="preserve">src/steps/login.steps.ts</w:t>
+            </w:r>
+          </w:p>
+        </w:tc>
+        <w:tc>
+          <w:tcPr>
+            <w:tcW w:type="dxa" w:w="1560"/>
+            <w:tcBorders>
+              <w:top w:val="single" w:color="BFBFBF" w:sz="1"/>
+              <w:left w:val="single" w:color="BFBFBF" w:sz="1"/>
+              <w:bottom w:val="single" w:color="BFBFBF" w:sz="1"/>
+              <w:right w:val="single" w:color="BFBFBF" w:sz="1"/>
+            </w:tcBorders>
+            <w:tcMar>
+              <w:top w:type="dxa" w:w="60"/>
+              <w:left w:type="dxa" w:w="110"/>
+              <w:bottom w:type="dxa" w:w="60"/>
+              <w:right w:type="dxa" w:w="110"/>
+            </w:tcMar>
+            <w:vAlign w:val="center"/>
+          </w:tcPr>
+          <w:p>
+            <w:pPr>
+              <w:spacing w:after="0"/>
+              <w:jc w:val="center"/>
+            </w:pPr>
+            <w:r>
+              <w:rPr>
+                <w:rFonts w:ascii="Arial" w:cs="Arial" w:eastAsia="Arial" w:hAnsi="Arial"/>
+                <w:b w:val="false"/>
+                <w:bCs w:val="false"/>
+                <w:sz w:val="18"/>
+                <w:szCs w:val="18"/>
+              </w:rPr>
+              <w:t xml:space="preserve">40 - 58</w:t>
+            </w:r>
+          </w:p>
+        </w:tc>
+        <w:tc>
+          <w:tcPr>
+            <w:tcW w:type="dxa" w:w="3920"/>
+            <w:tcBorders>
+              <w:top w:val="single" w:color="BFBFBF" w:sz="1"/>
+              <w:left w:val="single" w:color="BFBFBF" w:sz="1"/>
+              <w:bottom w:val="single" w:color="BFBFBF" w:sz="1"/>
+              <w:right w:val="single" w:color="BFBFBF" w:sz="1"/>
+            </w:tcBorders>
+            <w:tcMar>
+              <w:top w:type="dxa" w:w="60"/>
+              <w:left w:type="dxa" w:w="110"/>
+              <w:bottom w:type="dxa" w:w="60"/>
+              <w:right w:type="dxa" w:w="110"/>
+            </w:tcMar>
+            <w:vAlign w:val="center"/>
+          </w:tcPr>
+          <w:p>
+            <w:pPr>
+              <w:spacing w:after="0"/>
+              <w:jc w:val="left"/>
+            </w:pPr>
+            <w:r>
+              <w:rPr>
+                <w:rFonts w:ascii="Arial" w:cs="Arial" w:eastAsia="Arial" w:hAnsi="Arial"/>
+                <w:b w:val="false"/>
+                <w:bCs w:val="false"/>
+                <w:sz w:val="18"/>
+                <w:szCs w:val="18"/>
+              </w:rPr>
+              <w:t xml:space="preserve">The "Then" step - reads &amp; logs the balance</w:t>
+            </w:r>
+          </w:p>
+        </w:tc>
+      </w:tr>
+      <w:tr>
+        <w:tc>
+          <w:tcPr>
+            <w:tcW w:type="dxa" w:w="520"/>
+            <w:tcBorders>
+              <w:top w:val="single" w:color="BFBFBF" w:sz="1"/>
+              <w:left w:val="single" w:color="BFBFBF" w:sz="1"/>
+              <w:bottom w:val="single" w:color="BFBFBF" w:sz="1"/>
+              <w:right w:val="single" w:color="BFBFBF" w:sz="1"/>
+            </w:tcBorders>
+            <w:shd w:fill="F4F6FB" w:val="clear"/>
+            <w:tcMar>
+              <w:top w:type="dxa" w:w="60"/>
+              <w:left w:type="dxa" w:w="110"/>
+              <w:bottom w:type="dxa" w:w="60"/>
+              <w:right w:type="dxa" w:w="110"/>
+            </w:tcMar>
+            <w:vAlign w:val="center"/>
+          </w:tcPr>
+          <w:p>
+            <w:pPr>
+              <w:spacing w:after="0"/>
+              <w:jc w:val="center"/>
+            </w:pPr>
+            <w:r>
+              <w:rPr>
+                <w:rFonts w:ascii="Arial" w:cs="Arial" w:eastAsia="Arial" w:hAnsi="Arial"/>
+                <w:b/>
+                <w:bCs/>
+                <w:sz w:val="18"/>
+                <w:szCs w:val="18"/>
+              </w:rPr>
+              <w:t xml:space="preserve">4</w:t>
+            </w:r>
+          </w:p>
+        </w:tc>
+        <w:tc>
+          <w:tcPr>
+            <w:tcW w:type="dxa" w:w="3360"/>
+            <w:tcBorders>
+              <w:top w:val="single" w:color="BFBFBF" w:sz="1"/>
+              <w:left w:val="single" w:color="BFBFBF" w:sz="1"/>
+              <w:bottom w:val="single" w:color="BFBFBF" w:sz="1"/>
+              <w:right w:val="single" w:color="BFBFBF" w:sz="1"/>
+            </w:tcBorders>
+            <w:shd w:fill="F4F6FB" w:val="clear"/>
+            <w:tcMar>
+              <w:top w:type="dxa" w:w="60"/>
+              <w:left w:type="dxa" w:w="110"/>
+              <w:bottom w:type="dxa" w:w="60"/>
+              <w:right w:type="dxa" w:w="110"/>
+            </w:tcMar>
+            <w:vAlign w:val="center"/>
+          </w:tcPr>
+          <w:p>
+            <w:pPr>
+              <w:spacing w:after="0"/>
+              <w:jc w:val="left"/>
+            </w:pPr>
+            <w:r>
+              <w:rPr>
+                <w:rFonts w:ascii="Arial" w:cs="Arial" w:eastAsia="Arial" w:hAnsi="Arial"/>
+                <w:b w:val="false"/>
+                <w:bCs w:val="false"/>
+                <w:sz w:val="18"/>
+                <w:szCs w:val="18"/>
+              </w:rPr>
+              <w:t xml:space="preserve">src/pages/HomePage.ts</w:t>
+            </w:r>
+          </w:p>
+        </w:tc>
+        <w:tc>
+          <w:tcPr>
+            <w:tcW w:type="dxa" w:w="1560"/>
+            <w:tcBorders>
+              <w:top w:val="single" w:color="BFBFBF" w:sz="1"/>
+              <w:left w:val="single" w:color="BFBFBF" w:sz="1"/>
+              <w:bottom w:val="single" w:color="BFBFBF" w:sz="1"/>
+              <w:right w:val="single" w:color="BFBFBF" w:sz="1"/>
+            </w:tcBorders>
+            <w:shd w:fill="F4F6FB" w:val="clear"/>
+            <w:tcMar>
+              <w:top w:type="dxa" w:w="60"/>
+              <w:left w:type="dxa" w:w="110"/>
+              <w:bottom w:type="dxa" w:w="60"/>
+              <w:right w:type="dxa" w:w="110"/>
+            </w:tcMar>
+            <w:vAlign w:val="center"/>
+          </w:tcPr>
+          <w:p>
+            <w:pPr>
+              <w:spacing w:after="0"/>
+              <w:jc w:val="center"/>
+            </w:pPr>
+            <w:r>
+              <w:rPr>
+                <w:rFonts w:ascii="Arial" w:cs="Arial" w:eastAsia="Arial" w:hAnsi="Arial"/>
+                <w:b w:val="false"/>
+                <w:bCs w:val="false"/>
+                <w:sz w:val="18"/>
+                <w:szCs w:val="18"/>
+              </w:rPr>
+              <w:t xml:space="preserve">22-27, 46-50</w:t>
+            </w:r>
+          </w:p>
+        </w:tc>
+        <w:tc>
+          <w:tcPr>
+            <w:tcW w:type="dxa" w:w="3920"/>
+            <w:tcBorders>
+              <w:top w:val="single" w:color="BFBFBF" w:sz="1"/>
+              <w:left w:val="single" w:color="BFBFBF" w:sz="1"/>
+              <w:bottom w:val="single" w:color="BFBFBF" w:sz="1"/>
+              <w:right w:val="single" w:color="BFBFBF" w:sz="1"/>
+            </w:tcBorders>
+            <w:shd w:fill="F4F6FB" w:val="clear"/>
+            <w:tcMar>
+              <w:top w:type="dxa" w:w="60"/>
+              <w:left w:type="dxa" w:w="110"/>
+              <w:bottom w:type="dxa" w:w="60"/>
+              <w:right w:type="dxa" w:w="110"/>
+            </w:tcMar>
+            <w:vAlign w:val="center"/>
+          </w:tcPr>
+          <w:p>
+            <w:pPr>
+              <w:spacing w:after="0"/>
+              <w:jc w:val="left"/>
+            </w:pPr>
+            <w:r>
+              <w:rPr>
+                <w:rFonts w:ascii="Arial" w:cs="Arial" w:eastAsia="Arial" w:hAnsi="Arial"/>
+                <w:b w:val="false"/>
+                <w:bCs w:val="false"/>
+                <w:sz w:val="18"/>
+                <w:szCs w:val="18"/>
+              </w:rPr>
+              <w:t xml:space="preserve">Selectors, then the login() method</w:t>
+            </w:r>
+          </w:p>
+        </w:tc>
+      </w:tr>
+      <w:tr>
+        <w:tc>
+          <w:tcPr>
+            <w:tcW w:type="dxa" w:w="520"/>
+            <w:tcBorders>
+              <w:top w:val="single" w:color="BFBFBF" w:sz="1"/>
+              <w:left w:val="single" w:color="BFBFBF" w:sz="1"/>
+              <w:bottom w:val="single" w:color="BFBFBF" w:sz="1"/>
+              <w:right w:val="single" w:color="BFBFBF" w:sz="1"/>
+            </w:tcBorders>
+            <w:tcMar>
+              <w:top w:type="dxa" w:w="60"/>
+              <w:left w:type="dxa" w:w="110"/>
+              <w:bottom w:type="dxa" w:w="60"/>
+              <w:right w:type="dxa" w:w="110"/>
+            </w:tcMar>
+            <w:vAlign w:val="center"/>
+          </w:tcPr>
+          <w:p>
+            <w:pPr>
+              <w:spacing w:after="0"/>
+              <w:jc w:val="center"/>
+            </w:pPr>
+            <w:r>
+              <w:rPr>
+                <w:rFonts w:ascii="Arial" w:cs="Arial" w:eastAsia="Arial" w:hAnsi="Arial"/>
+                <w:b/>
+                <w:bCs/>
+                <w:sz w:val="18"/>
+                <w:szCs w:val="18"/>
+              </w:rPr>
+              <w:t xml:space="preserve">5</w:t>
+            </w:r>
+          </w:p>
+        </w:tc>
+        <w:tc>
+          <w:tcPr>
+            <w:tcW w:type="dxa" w:w="3360"/>
+            <w:tcBorders>
+              <w:top w:val="single" w:color="BFBFBF" w:sz="1"/>
+              <w:left w:val="single" w:color="BFBFBF" w:sz="1"/>
+              <w:bottom w:val="single" w:color="BFBFBF" w:sz="1"/>
+              <w:right w:val="single" w:color="BFBFBF" w:sz="1"/>
+            </w:tcBorders>
+            <w:tcMar>
+              <w:top w:type="dxa" w:w="60"/>
+              <w:left w:type="dxa" w:w="110"/>
+              <w:bottom w:type="dxa" w:w="60"/>
+              <w:right w:type="dxa" w:w="110"/>
+            </w:tcMar>
+            <w:vAlign w:val="center"/>
+          </w:tcPr>
+          <w:p>
+            <w:pPr>
+              <w:spacing w:after="0"/>
+              <w:jc w:val="left"/>
+            </w:pPr>
+            <w:r>
+              <w:rPr>
+                <w:rFonts w:ascii="Arial" w:cs="Arial" w:eastAsia="Arial" w:hAnsi="Arial"/>
+                <w:b w:val="false"/>
+                <w:bCs w:val="false"/>
+                <w:sz w:val="18"/>
+                <w:szCs w:val="18"/>
+              </w:rPr>
+              <w:t xml:space="preserve">src/pages/AccountOverviewPage.ts</w:t>
+            </w:r>
+          </w:p>
+        </w:tc>
+        <w:tc>
+          <w:tcPr>
+            <w:tcW w:type="dxa" w:w="1560"/>
+            <w:tcBorders>
+              <w:top w:val="single" w:color="BFBFBF" w:sz="1"/>
+              <w:left w:val="single" w:color="BFBFBF" w:sz="1"/>
+              <w:bottom w:val="single" w:color="BFBFBF" w:sz="1"/>
+              <w:right w:val="single" w:color="BFBFBF" w:sz="1"/>
+            </w:tcBorders>
+            <w:tcMar>
+              <w:top w:type="dxa" w:w="60"/>
+              <w:left w:type="dxa" w:w="110"/>
+              <w:bottom w:type="dxa" w:w="60"/>
+              <w:right w:type="dxa" w:w="110"/>
+            </w:tcMar>
+            <w:vAlign w:val="center"/>
+          </w:tcPr>
+          <w:p>
+            <w:pPr>
+              <w:spacing w:after="0"/>
+              <w:jc w:val="center"/>
+            </w:pPr>
+            <w:r>
+              <w:rPr>
+                <w:rFonts w:ascii="Arial" w:cs="Arial" w:eastAsia="Arial" w:hAnsi="Arial"/>
+                <w:b w:val="false"/>
+                <w:bCs w:val="false"/>
+                <w:sz w:val="18"/>
+                <w:szCs w:val="18"/>
+              </w:rPr>
+              <w:t xml:space="preserve">24-26, 51-55</w:t>
+            </w:r>
+          </w:p>
+        </w:tc>
+        <w:tc>
+          <w:tcPr>
+            <w:tcW w:type="dxa" w:w="3920"/>
+            <w:tcBorders>
+              <w:top w:val="single" w:color="BFBFBF" w:sz="1"/>
+              <w:left w:val="single" w:color="BFBFBF" w:sz="1"/>
+              <w:bottom w:val="single" w:color="BFBFBF" w:sz="1"/>
+              <w:right w:val="single" w:color="BFBFBF" w:sz="1"/>
+            </w:tcBorders>
+            <w:tcMar>
+              <w:top w:type="dxa" w:w="60"/>
+              <w:left w:type="dxa" w:w="110"/>
+              <w:bottom w:type="dxa" w:w="60"/>
+              <w:right w:type="dxa" w:w="110"/>
+            </w:tcMar>
+            <w:vAlign w:val="center"/>
+          </w:tcPr>
+          <w:p>
+            <w:pPr>
+              <w:spacing w:after="0"/>
+              <w:jc w:val="left"/>
+            </w:pPr>
+            <w:r>
+              <w:rPr>
+                <w:rFonts w:ascii="Arial" w:cs="Arial" w:eastAsia="Arial" w:hAnsi="Arial"/>
+                <w:b w:val="false"/>
+                <w:bCs w:val="false"/>
+                <w:sz w:val="18"/>
+                <w:szCs w:val="18"/>
+              </w:rPr>
+              <w:t xml:space="preserve">Reading the balance from the table</w:t>
+            </w:r>
+          </w:p>
+        </w:tc>
+      </w:tr>
+      <w:tr>
+        <w:tc>
+          <w:tcPr>
+            <w:tcW w:type="dxa" w:w="520"/>
+            <w:tcBorders>
+              <w:top w:val="single" w:color="BFBFBF" w:sz="1"/>
+              <w:left w:val="single" w:color="BFBFBF" w:sz="1"/>
+              <w:bottom w:val="single" w:color="BFBFBF" w:sz="1"/>
+              <w:right w:val="single" w:color="BFBFBF" w:sz="1"/>
+            </w:tcBorders>
+            <w:shd w:fill="F4F6FB" w:val="clear"/>
+            <w:tcMar>
+              <w:top w:type="dxa" w:w="60"/>
+              <w:left w:type="dxa" w:w="110"/>
+              <w:bottom w:type="dxa" w:w="60"/>
+              <w:right w:type="dxa" w:w="110"/>
+            </w:tcMar>
+            <w:vAlign w:val="center"/>
+          </w:tcPr>
+          <w:p>
+            <w:pPr>
+              <w:spacing w:after="0"/>
+              <w:jc w:val="center"/>
+            </w:pPr>
+            <w:r>
+              <w:rPr>
+                <w:rFonts w:ascii="Arial" w:cs="Arial" w:eastAsia="Arial" w:hAnsi="Arial"/>
+                <w:b/>
+                <w:bCs/>
+                <w:sz w:val="18"/>
+                <w:szCs w:val="18"/>
+              </w:rPr>
+              <w:t xml:space="preserve">6</w:t>
+            </w:r>
+          </w:p>
+        </w:tc>
+        <w:tc>
+          <w:tcPr>
+            <w:tcW w:type="dxa" w:w="3360"/>
+            <w:tcBorders>
+              <w:top w:val="single" w:color="BFBFBF" w:sz="1"/>
+              <w:left w:val="single" w:color="BFBFBF" w:sz="1"/>
+              <w:bottom w:val="single" w:color="BFBFBF" w:sz="1"/>
+              <w:right w:val="single" w:color="BFBFBF" w:sz="1"/>
+            </w:tcBorders>
+            <w:shd w:fill="F4F6FB" w:val="clear"/>
+            <w:tcMar>
+              <w:top w:type="dxa" w:w="60"/>
+              <w:left w:type="dxa" w:w="110"/>
+              <w:bottom w:type="dxa" w:w="60"/>
+              <w:right w:type="dxa" w:w="110"/>
+            </w:tcMar>
+            <w:vAlign w:val="center"/>
+          </w:tcPr>
+          <w:p>
+            <w:pPr>
+              <w:spacing w:after="0"/>
+              <w:jc w:val="left"/>
+            </w:pPr>
+            <w:r>
+              <w:rPr>
+                <w:rFonts w:ascii="Arial" w:cs="Arial" w:eastAsia="Arial" w:hAnsi="Arial"/>
+                <w:b w:val="false"/>
+                <w:bCs w:val="false"/>
+                <w:sz w:val="18"/>
+                <w:szCs w:val="18"/>
+              </w:rPr>
+              <w:t xml:space="preserve">src/support/fixtures.ts</w:t>
+            </w:r>
+          </w:p>
+        </w:tc>
+        <w:tc>
+          <w:tcPr>
+            <w:tcW w:type="dxa" w:w="1560"/>
+            <w:tcBorders>
+              <w:top w:val="single" w:color="BFBFBF" w:sz="1"/>
+              <w:left w:val="single" w:color="BFBFBF" w:sz="1"/>
+              <w:bottom w:val="single" w:color="BFBFBF" w:sz="1"/>
+              <w:right w:val="single" w:color="BFBFBF" w:sz="1"/>
+            </w:tcBorders>
+            <w:shd w:fill="F4F6FB" w:val="clear"/>
+            <w:tcMar>
+              <w:top w:type="dxa" w:w="60"/>
+              <w:left w:type="dxa" w:w="110"/>
+              <w:bottom w:type="dxa" w:w="60"/>
+              <w:right w:type="dxa" w:w="110"/>
+            </w:tcMar>
+            <w:vAlign w:val="center"/>
+          </w:tcPr>
+          <w:p>
+            <w:pPr>
+              <w:spacing w:after="0"/>
+              <w:jc w:val="center"/>
+            </w:pPr>
+            <w:r>
+              <w:rPr>
+                <w:rFonts w:ascii="Arial" w:cs="Arial" w:eastAsia="Arial" w:hAnsi="Arial"/>
+                <w:b w:val="false"/>
+                <w:bCs w:val="false"/>
+                <w:sz w:val="18"/>
+                <w:szCs w:val="18"/>
+              </w:rPr>
+              <w:t xml:space="preserve">35-46, 248-266</w:t>
+            </w:r>
+          </w:p>
+        </w:tc>
+        <w:tc>
+          <w:tcPr>
+            <w:tcW w:type="dxa" w:w="3920"/>
+            <w:tcBorders>
+              <w:top w:val="single" w:color="BFBFBF" w:sz="1"/>
+              <w:left w:val="single" w:color="BFBFBF" w:sz="1"/>
+              <w:bottom w:val="single" w:color="BFBFBF" w:sz="1"/>
+              <w:right w:val="single" w:color="BFBFBF" w:sz="1"/>
+            </w:tcBorders>
+            <w:shd w:fill="F4F6FB" w:val="clear"/>
+            <w:tcMar>
+              <w:top w:type="dxa" w:w="60"/>
+              <w:left w:type="dxa" w:w="110"/>
+              <w:bottom w:type="dxa" w:w="60"/>
+              <w:right w:type="dxa" w:w="110"/>
+            </w:tcMar>
+            <w:vAlign w:val="center"/>
+          </w:tcPr>
+          <w:p>
+            <w:pPr>
+              <w:spacing w:after="0"/>
+              <w:jc w:val="left"/>
+            </w:pPr>
+            <w:r>
+              <w:rPr>
+                <w:rFonts w:ascii="Arial" w:cs="Arial" w:eastAsia="Arial" w:hAnsi="Arial"/>
+                <w:b w:val="false"/>
+                <w:bCs w:val="false"/>
+                <w:sz w:val="18"/>
+                <w:szCs w:val="18"/>
+              </w:rPr>
+              <w:t xml:space="preserve">Fixtures wire the POM into the steps</w:t>
+            </w:r>
+          </w:p>
+        </w:tc>
+      </w:tr>
+    </w:tbl>
+    <w:p>
+      <w:pPr>
+        <w:spacing w:after="110"/>
+      </w:pPr>
+      <w:r>
+        <w:rPr>
+          <w:rFonts w:ascii="Arial" w:cs="Arial" w:eastAsia="Arial" w:hAnsi="Arial"/>
+        </w:rPr>
+        <w:t xml:space="preserve"/>
       </w:r>
     </w:p>
     <w:p>
@@ -2187,7 +3206,7 @@
           <w:sz w:val="19"/>
           <w:szCs w:val="19"/>
         </w:rPr>
-        <w:t xml:space="preserve">The project folder in the editor</w:t>
+        <w:t xml:space="preserve">1.  features/account-login.feature   -   lines 8 to 13</w:t>
       </w:r>
     </w:p>
     <w:tbl>
@@ -2250,7 +3269,7 @@
                 <w:sz w:val="21"/>
                 <w:szCs w:val="21"/>
               </w:rPr>
-              <w:t xml:space="preserve">Here is the project. Three layers: the features folder holds the Gherkin scenarios, the steps folder implements them, and the pages folder holds the page objects with all the selectors.</w:t>
+              <w:t xml:space="preserve">This is the core scenario. Line 8 is the tag - @smoke @positive - marking it a critical happy-path test. Lines 9 to 13 are the scenario itself, in plain Gherkin: Given a customer has registered, When they sign in, Then the Accounts Overview page is displayed, And the account balance is shown and logged. This file is the living specification - anyone can read it, and Playwright runs these exact lines.</w:t>
             </w:r>
           </w:p>
         </w:tc>
@@ -2280,7 +3299,7 @@
           <w:sz w:val="19"/>
           <w:szCs w:val="19"/>
         </w:rPr>
-        <w:t xml:space="preserve">Open  features/account-login.feature</w:t>
+        <w:t xml:space="preserve">2.  src/steps/login.steps.ts   -   lines 28 to 34   (the "When" step)</w:t>
       </w:r>
     </w:p>
     <w:tbl>
@@ -2343,7 +3362,7 @@
                 <w:sz w:val="21"/>
                 <w:szCs w:val="21"/>
               </w:rPr>
-              <w:t xml:space="preserve">This is the core scenario - "Sign in with a newly created account and view the balance." It is plain Gherkin: Given a customer has registered, When they sign in, Then the Accounts Overview page is shown, And the balance is logged. Anyone can read this - it is the living specification.</w:t>
+              <w:t xml:space="preserve">Each Gherkin line maps to a step definition here. This is the "When" step. Look how thin it is - line 31 calls homePage.login with the username and password, and line 32 waits for the Accounts Overview page to load. No selectors, no raw Playwright calls - the step only orchestrates page-object methods.</w:t>
             </w:r>
           </w:p>
         </w:tc>
@@ -2373,7 +3392,7 @@
           <w:sz w:val="19"/>
           <w:szCs w:val="19"/>
         </w:rPr>
-        <w:t xml:space="preserve">Open  src/steps/login.steps.ts</w:t>
+        <w:t xml:space="preserve">3.  src/steps/login.steps.ts   -   lines 40 to 58   (the balance "Then" step)</w:t>
       </w:r>
     </w:p>
     <w:tbl>
@@ -2436,7 +3455,7 @@
                 <w:sz w:val="21"/>
                 <w:szCs w:val="21"/>
               </w:rPr>
-              <w:t xml:space="preserve">Each Gherkin line maps to a step definition here. Notice how thin they are - the "When" step just calls homePage.login, then waits for the overview page. There are no selectors and no raw Playwright calls in the steps - only page-object methods.</w:t>
+              <w:t xml:space="preserve">This step is the heart of the assignment. Line 43 reads the account number; line 44 reads the balance. Lines 47 to 49 assert the balance is a real currency value. And line 52 logs it. That is "log the amount displayed after login" - exactly what the task asked for.</w:t>
             </w:r>
           </w:p>
         </w:tc>
@@ -2466,7 +3485,7 @@
           <w:sz w:val="19"/>
           <w:szCs w:val="19"/>
         </w:rPr>
-        <w:t xml:space="preserve">Open  src/pages/HomePage.ts</w:t>
+        <w:t xml:space="preserve">4.  src/pages/HomePage.ts   -   lines 22 to 27, then 46 to 50</w:t>
       </w:r>
     </w:p>
     <w:tbl>
@@ -2529,7 +3548,7 @@
                 <w:sz w:val="21"/>
                 <w:szCs w:val="21"/>
               </w:rPr>
-              <w:t xml:space="preserve">Those methods live in the page objects. This is HomePage - the login method fills the username and password and clicks the button. Every selector for this page is in this one class, so if the UI changes, the fix is one line, right here.</w:t>
+              <w:t xml:space="preserve">The step called homePage.login - here is that page object. Lines 22 to 27, in the constructor, hold every selector for this page - the username field, password field and login button. Lines 46 to 50 are the login method - fill the username, fill the password, click the button. One class owns this page, so a UI change is a one-line fix, right here.</w:t>
             </w:r>
           </w:p>
         </w:tc>
@@ -2559,7 +3578,7 @@
           <w:sz w:val="19"/>
           <w:szCs w:val="19"/>
         </w:rPr>
-        <w:t xml:space="preserve">Open  src/pages/AccountOverviewPage.ts</w:t>
+        <w:t xml:space="preserve">5.  src/pages/AccountOverviewPage.ts   -   lines 24 to 26, then 51 to 55</w:t>
       </w:r>
     </w:p>
     <w:tbl>
@@ -2622,7 +3641,7 @@
                 <w:sz w:val="21"/>
                 <w:szCs w:val="21"/>
               </w:rPr>
-              <w:t xml:space="preserve">After signing in we land here - AccountOverviewPage. This method reads the balance from the accounts table. The step then logs that balance - which is exactly what the assignment asked for.</w:t>
+              <w:t xml:space="preserve">After signing in we land here. Lines 24 to 26 locate the data rows of the accounts table. The getFirstAccountBalance method, lines 51 to 55, reads the balance cell from the first row - that is the value the step logged a moment ago.</w:t>
             </w:r>
           </w:p>
         </w:tc>
@@ -2652,7 +3671,7 @@
           <w:sz w:val="19"/>
           <w:szCs w:val="19"/>
         </w:rPr>
-        <w:t xml:space="preserve">Open  src/support/fixtures.ts</w:t>
+        <w:t xml:space="preserve">6.  src/support/fixtures.ts   -   lines 35 to 46, then 248 to 266</w:t>
       </w:r>
     </w:p>
     <w:tbl>
@@ -2715,7 +3734,7 @@
                 <w:sz w:val="21"/>
                 <w:szCs w:val="21"/>
               </w:rPr>
-              <w:t xml:space="preserve">And fixtures tie it together - they build a fresh page object and a unique customer for every scenario and inject them into the steps. That is the bridge between BDD and the Page Object Model.</w:t>
+              <w:t xml:space="preserve">Finally, fixtures tie everything together. Lines 35 to 46 declare the fixtures - the page objects and a customer. Lines 248 to 266 build them: a fresh page object and a unique customer for every scenario, injected straight into each step. That is the bridge between BDD and the Page Object Model.</w:t>
             </w:r>
           </w:p>
         </w:tc>

</xml_diff>

<commit_message>
docs: correct code line references in the demo run-sheet
</commit_message>
<xml_diff>
--- a/presentation/ParaBank_10min_Demo_Runsheet.docx
+++ b/presentation/ParaBank_10min_Demo_Runsheet.docx
@@ -2850,7 +2850,7 @@
                 <w:sz w:val="18"/>
                 <w:szCs w:val="18"/>
               </w:rPr>
-              <w:t xml:space="preserve">22-27, 46-50</w:t>
+              <w:t xml:space="preserve">22-27, 51-55</w:t>
             </w:r>
           </w:p>
         </w:tc>
@@ -3485,7 +3485,7 @@
           <w:sz w:val="19"/>
           <w:szCs w:val="19"/>
         </w:rPr>
-        <w:t xml:space="preserve">4.  src/pages/HomePage.ts   -   lines 22 to 27, then 46 to 50</w:t>
+        <w:t xml:space="preserve">4.  src/pages/HomePage.ts   -   lines 22 to 27, then 51 to 55</w:t>
       </w:r>
     </w:p>
     <w:tbl>
@@ -3548,7 +3548,7 @@
                 <w:sz w:val="21"/>
                 <w:szCs w:val="21"/>
               </w:rPr>
-              <w:t xml:space="preserve">The step called homePage.login - here is that page object. Lines 22 to 27, in the constructor, hold every selector for this page - the username field, password field and login button. Lines 46 to 50 are the login method - fill the username, fill the password, click the button. One class owns this page, so a UI change is a one-line fix, right here.</w:t>
+              <w:t xml:space="preserve">The step called homePage.login - here is that page object. Lines 22 to 27, in the constructor, hold every selector for this page - the username field, password field and login button. Lines 51 to 55 are the login method - fill the username, fill the password, click the button. One class owns this page, so a UI change is a one-line fix, right here.</w:t>
             </w:r>
           </w:p>
         </w:tc>

</xml_diff>